<commit_message>
Refactored, rewards now caped at 600K
</commit_message>
<xml_diff>
--- a/PayDay_Token_White_Paper.docx
+++ b/PayDay_Token_White_Paper.docx
@@ -72,15 +72,42 @@
       </w:r>
       <w:r>
         <w:br/>
-        <w:t>- 20% allocated to the creator.</w:t>
+        <w:t>- 20% allocated to the creator</w:t>
+      </w:r>
+      <w:r>
+        <w:t>s and developers</w:t>
+      </w:r>
+      <w:r>
+        <w:t>.</w:t>
       </w:r>
       <w:r>
         <w:br/>
-        <w:t>- 10% allocated to promoters who will support the project through various marketing channels.</w:t>
+        <w:t xml:space="preserve">- 10% allocated to </w:t>
+      </w:r>
+      <w:r>
+        <w:t>Presale</w:t>
+      </w:r>
+      <w:r>
+        <w:t>.</w:t>
+      </w:r>
+      <w:r>
+        <w:t xml:space="preserve">                                                                                                                                                              – 10% allocated to </w:t>
+      </w:r>
+      <w:r>
+        <w:t>PayDay Millionaire League</w:t>
+      </w:r>
+      <w:r>
+        <w:t>.</w:t>
       </w:r>
       <w:r>
         <w:br/>
-        <w:t>- 70% allocated to LinkedIn community members.</w:t>
+        <w:t xml:space="preserve">- </w:t>
+      </w:r>
+      <w:r>
+        <w:t>6</w:t>
+      </w:r>
+      <w:r>
+        <w:t>0% allocated to community members.</w:t>
       </w:r>
     </w:p>
     <w:p>
@@ -96,7 +123,13 @@
         <w:pStyle w:val="Heading2"/>
       </w:pPr>
       <w:r>
-        <w:t>Creator Allocation (20%)</w:t>
+        <w:t xml:space="preserve">Creator </w:t>
+      </w:r>
+      <w:r>
+        <w:t xml:space="preserve">&amp; Developers </w:t>
+      </w:r>
+      <w:r>
+        <w:t>Allocation (20%)</w:t>
       </w:r>
     </w:p>
     <w:p>
@@ -109,12 +142,18 @@
         <w:pStyle w:val="Heading2"/>
       </w:pPr>
       <w:r>
-        <w:t>Promoter Allocation (10%)</w:t>
+        <w:t>Presale Allocation</w:t>
+      </w:r>
+      <w:r>
+        <w:t xml:space="preserve"> (10%)</w:t>
       </w:r>
     </w:p>
     <w:p>
       <w:r>
-        <w:t>A total of 10 billion PDAY tokens (10% of the total supply) are allocated to promoters, who will play a critical role in spreading awareness and driving community engagement through marketing initiatives. Promoters will help build trust, visibility, and drive early adoption of the token.</w:t>
+        <w:t xml:space="preserve">A total of 10 billion PDAY tokens (10% of the total supply) are allocated </w:t>
+      </w:r>
+      <w:r>
+        <w:t>to Presale.</w:t>
       </w:r>
     </w:p>
     <w:p>
@@ -122,47 +161,128 @@
         <w:pStyle w:val="Heading2"/>
       </w:pPr>
       <w:r>
-        <w:t>LinkedIn Community Distribution (70%)</w:t>
+        <w:t>Millionaire League</w:t>
+      </w:r>
+      <w:r>
+        <w:t xml:space="preserve"> (10%)</w:t>
       </w:r>
     </w:p>
     <w:p>
       <w:r>
-        <w:t>The majority of tokens, 70 billion PDAY (70% of the total supply), are designated to be shared with 70,000 LinkedIn members. The distribution will occur as part of a promotional campaign aimed at building a community of token holders. To qualify for the token distribution, LinkedIn users need to:</w:t>
+        <w:t xml:space="preserve">A total of 10 billion PDAY tokens (10% of the total supply) are allocated to </w:t>
+      </w:r>
+      <w:r>
+        <w:t>PayDay Millio</w:t>
+      </w:r>
+      <w:r>
+        <w:t xml:space="preserve">naire League, this will be distributed to </w:t>
+      </w:r>
+      <w:r>
+        <w:t xml:space="preserve">10,000 </w:t>
+      </w:r>
+      <w:r>
+        <w:t xml:space="preserve">presale </w:t>
+      </w:r>
+      <w:r>
+        <w:t>participants.</w:t>
+      </w:r>
+    </w:p>
+    <w:p/>
+    <w:p>
+      <w:pPr>
+        <w:pStyle w:val="Heading2"/>
+      </w:pPr>
+      <w:r>
+        <w:t>Community Distribution (</w:t>
+      </w:r>
+      <w:r>
+        <w:t>6</w:t>
+      </w:r>
+      <w:r>
+        <w:t>0%)</w:t>
+      </w:r>
+    </w:p>
+    <w:p>
+      <w:r>
+        <w:t xml:space="preserve">The majority of tokens, </w:t>
+      </w:r>
+      <w:r>
+        <w:t>6</w:t>
+      </w:r>
+      <w:r>
+        <w:t>0 billion PDAY (</w:t>
+      </w:r>
+      <w:r>
+        <w:t>6</w:t>
+      </w:r>
+      <w:r>
+        <w:t xml:space="preserve">0% of the total supply), are designated to be shared with </w:t>
+      </w:r>
+      <w:r>
+        <w:t>to 600,000 Community members through our Telegram web app (</w:t>
+      </w:r>
+      <w:r>
+        <w:t>https://t.me/paydaytokenbot?start=ar1926451270</w:t>
+      </w:r>
+      <w:r>
+        <w:t>) who:</w:t>
       </w:r>
       <w:r>
         <w:br/>
-        <w:t>- Like the promotional post.</w:t>
+        <w:t>1. Follow us LinkedIn                                                                                                                                      2. Join our Telegram Community (https://t.me/tokenpayday)</w:t>
       </w:r>
       <w:r>
         <w:br/>
-        <w:t>- Comment on the post with their TON wallet address.</w:t>
+        <w:t>3. Follow us on X.com</w:t>
       </w:r>
       <w:r>
         <w:br/>
-        <w:t>- Repost the post to spread awareness.</w:t>
+        <w:t>4. Repost our post on x.com to spread the word</w:t>
       </w:r>
       <w:r>
         <w:br/>
-        <w:t>- Send 0.</w:t>
+        <w:t>5. Connect their TON wallet and Send 0.2 TON for gas fee.</w:t>
       </w:r>
       <w:r>
-        <w:t>2</w:t>
+        <w:br/>
       </w:r>
-      <w:r>
-        <w:t xml:space="preserve"> TON to the PayDay wallet address: UQBHTgwIOT5lb3XnylLWWdKRn4ilCgufkw-sZw21yv4WUpK2.</w:t>
-      </w:r>
-    </w:p>
-    <w:p>
-      <w:pPr>
-        <w:pStyle w:val="Heading1"/>
-      </w:pPr>
       <w:r>
         <w:t>Token Distribution Campaign</w:t>
       </w:r>
     </w:p>
     <w:p>
       <w:r>
-        <w:t>The goal of the PayDay token is to distribute 70 billion tokens to 70,000 LinkedIn users, encouraging early adoption and building a strong community of supporters. Each eligible LinkedIn user will receive an equal share of the tokens. This community-driven distribution model ensures that a broad base of users becomes familiar with the token, its use cases, and the long-term vision.</w:t>
+        <w:t xml:space="preserve">The goal of the PayDay token is to distribute </w:t>
+      </w:r>
+      <w:r>
+        <w:t>6</w:t>
+      </w:r>
+      <w:r>
+        <w:t xml:space="preserve">0 billion tokens to </w:t>
+      </w:r>
+      <w:r>
+        <w:t>60</w:t>
+      </w:r>
+      <w:r>
+        <w:t xml:space="preserve">0,000 </w:t>
+      </w:r>
+      <w:r>
+        <w:t>community</w:t>
+      </w:r>
+      <w:r>
+        <w:t xml:space="preserve"> </w:t>
+      </w:r>
+      <w:r>
+        <w:t>memebers</w:t>
+      </w:r>
+      <w:r>
+        <w:t xml:space="preserve">, encouraging early adoption and building a strong community of supporters. Each eligible </w:t>
+      </w:r>
+      <w:r>
+        <w:t>memeber</w:t>
+      </w:r>
+      <w:r>
+        <w:t xml:space="preserve"> will receive an equal share of the tokens. This community-driven distribution model ensures that a broad base of users becomes familiar with the token, its use cases, and the long-term vision.</w:t>
       </w:r>
     </w:p>
     <w:p>
@@ -212,7 +332,25 @@
     </w:p>
     <w:p>
       <w:r>
-        <w:t>- Distribute 70 billion tokens to LinkedIn users following the outlined campaign.</w:t>
+        <w:t xml:space="preserve">- Distribute </w:t>
+      </w:r>
+      <w:r>
+        <w:t>6</w:t>
+      </w:r>
+      <w:r>
+        <w:t xml:space="preserve">0 billion tokens to </w:t>
+      </w:r>
+      <w:r>
+        <w:t>Community</w:t>
+      </w:r>
+      <w:r>
+        <w:t xml:space="preserve"> </w:t>
+      </w:r>
+      <w:r>
+        <w:t>members</w:t>
+      </w:r>
+      <w:r>
+        <w:t xml:space="preserve"> following the outlined campaign.</w:t>
       </w:r>
       <w:r>
         <w:br/>
@@ -229,7 +367,23 @@
     </w:p>
     <w:p>
       <w:r>
-        <w:t>The objective of the token presale is to secure the necessary funding for listing the token on exchanges and to support the ongoing development of the project. During the presale, tokens will be available at an expected price of $0.0001, with a listing price projected at a minimum of $0.0006. This offers an early opportunity for participants to engage with and contribute to the project’s growth while benefiting from the potential value increase.</w:t>
+        <w:t>The objective of the token presale is to secure the necessary funding for listing the token on exchanges and to support the ongoing development of the project. During the presale, tokens will be available at an expected price of $0.000</w:t>
+      </w:r>
+      <w:r>
+        <w:t>6</w:t>
+      </w:r>
+      <w:r>
+        <w:t xml:space="preserve">, with a listing price projected at a </w:t>
+      </w:r>
+      <w:r>
+        <w:lastRenderedPageBreak/>
+        <w:t>minimum of $0.00</w:t>
+      </w:r>
+      <w:r>
+        <w:t>1</w:t>
+      </w:r>
+      <w:r>
+        <w:t>. This offers an early opportunity for participants to engage with and contribute to the project’s growth while benefiting from the potential value increase.</w:t>
       </w:r>
     </w:p>
     <w:p>
@@ -12224,7 +12378,6 @@
 <ds:datastoreItem xmlns:ds="http://schemas.openxmlformats.org/officeDocument/2006/customXml" ds:itemID="{EF278816-EC6F-A645-907D-7F25AECB1D4A}">
   <ds:schemaRefs>
     <ds:schemaRef ds:uri="http://schemas.openxmlformats.org/officeDocument/2006/bibliography"/>
-    <ds:schemaRef ds:uri="http://www.w3.org/2000/xmlns/"/>
   </ds:schemaRefs>
 </ds:datastoreItem>
 </file>
</xml_diff>